<commit_message>
Update report: correct project title and framing
Title: "Architecting an Explainable Multi-Agent System for
Imperfect-Profile Games: A Case Study on Azul"
OppoProfile positioned as the experimental platform within
the broader research project. ISS Supervisor: Zhengqing Hu.

Co-Authored-By: Claude Opus 4.6 (1M context) <noreply@anthropic.com>
</commit_message>
<xml_diff>
--- a/docs/Milestone_1_Report.docx
+++ b/docs/Milestone_1_Report.docx
@@ -12,9 +12,11 @@
         <w:rPr>
           <w:b/>
           <w:color w:val="1A5276"/>
-          <w:sz w:val="52"/>
+          <w:sz w:val="44"/>
         </w:rPr>
-        <w:t>Multi-Agent Board Game Intelligence</w:t>
+        <w:t>Architecting an Explainable Multi-Agent System</w:t>
+        <w:br/>
+        <w:t>for Imperfect-Profile Games</w:t>
       </w:r>
     </w:p>
     <w:p>
@@ -25,6 +27,18 @@
         <w:rPr>
           <w:color w:val="2980B9"/>
           <w:sz w:val="32"/>
+        </w:rPr>
+        <w:t>A Case Study on Azul</w:t>
+      </w:r>
+    </w:p>
+    <w:p>
+      <w:pPr>
+        <w:jc w:val="center"/>
+      </w:pPr>
+      <w:r>
+        <w:rPr>
+          <w:color w:val="7F8C8D"/>
+          <w:sz w:val="28"/>
         </w:rPr>
         <w:t>Milestone 1 Progress Report</w:t>
       </w:r>
@@ -66,6 +80,7 @@
       </w:r>
       <w:r>
         <w:rPr>
+          <w:b/>
           <w:sz w:val="22"/>
         </w:rPr>
         <w:t>ISS Supervisor: Zhengqing Hu</w:t>
@@ -137,12 +152,12 @@
     </w:p>
     <w:p>
       <w:r>
-        <w:t>OppoProfile is an AI-driven platform that automates gameplay on the board game Azul, enabling Machine Learning agents to compete, observe, and profile player behavior. The platform bridges the gap between a live web-based game (buddyboardgames.com) and custom ML models, creating an end-to-end pipeline for game intelligence research.</w:t>
+        <w:t>This project investigates how explainable multi-agent systems can be architected for imperfect-profile games — games where opponent intentions and play styles are unknown and must be inferred during gameplay. Using Azul as a case study, we develop both the research framework and a supporting platform, OppoProfile, that enables AI agents to compete on a live game platform, record complete game data, and profile opponent behavior.</w:t>
       </w:r>
     </w:p>
     <w:p>
       <w:r>
-        <w:t>In this first milestone, we have delivered a fully functional MVP that can:</w:t>
+        <w:t>In this first milestone, we have delivered OppoProfile as a fully functional MVP that can:</w:t>
       </w:r>
     </w:p>
     <w:p>
@@ -179,7 +194,7 @@
     </w:p>
     <w:p>
       <w:r>
-        <w:t>The platform is built on a modern, extensible architecture (React + FastAPI + Playwright + SQLite) with 105 automated tests covering rules validation, ML decision-making, API integrity, and full-game simulation.</w:t>
+        <w:t>OppoProfile is built on a modern, extensible architecture (React + FastAPI + Playwright + SQLite) with 105 automated tests. It serves as the experimental platform for the research components: opponent modeling, adaptive play strategies, and explainable decision-making.</w:t>
       </w:r>
     </w:p>
     <w:p>

</xml_diff>

<commit_message>
Add system architecture diagram with AI component boxes
Architecture section now includes a visual diagram with colored boxes
for each AI component: Validator (blue), Tactician (green),
Profiler (purple), Explainer (gold). Shows data flow between
components, the Play Engine layer, and external platform.

Co-Authored-By: Claude Opus 4.6 (1M context) <noreply@anthropic.com>
</commit_message>
<xml_diff>
--- a/docs/Milestone_1_Report.docx
+++ b/docs/Milestone_1_Report.docx
@@ -392,7 +392,7 @@
     </w:p>
     <w:p>
       <w:r>
-        <w:t>The system is organized into four AI-focused components (Validator, Tactician, Profiler, Explainer) orchestrated by a Play Engine that manages browser sessions and game communication.</w:t>
+        <w:t>The system is organized into four AI-focused components (Validator, Tactician, Profiler, Explainer) orchestrated by a Play Engine that manages browser sessions and game communication. The diagram below shows the component architecture and data flow.</w:t>
       </w:r>
     </w:p>
     <w:p>
@@ -403,12 +403,450 @@
         <w:rPr>
           <w:color w:val="1A5276"/>
         </w:rPr>
-        <w:t>3.1 Multi-Agent Decision Stack</w:t>
+        <w:t>3.1 System Architecture Diagram</w:t>
+      </w:r>
+    </w:p>
+    <w:tbl>
+      <w:tblPr>
+        <w:tblW w:type="auto" w:w="0"/>
+        <w:jc w:val="center"/>
+        <w:tblLook w:firstColumn="1" w:firstRow="1" w:lastColumn="0" w:lastRow="0" w:noHBand="0" w:noVBand="1" w:val="04A0"/>
+      </w:tblPr>
+      <w:tblGrid>
+        <w:gridCol w:w="1881"/>
+        <w:gridCol w:w="1881"/>
+        <w:gridCol w:w="1881"/>
+        <w:gridCol w:w="1881"/>
+        <w:gridCol w:w="1881"/>
+      </w:tblGrid>
+      <w:tr>
+        <w:tc>
+          <w:tcPr>
+            <w:tcW w:type="dxa" w:w="9405"/>
+            <w:gridSpan w:val="5"/>
+            <w:shd w:fill="34495E" w:val="clear"/>
+          </w:tcPr>
+          <w:p>
+            <w:pPr>
+              <w:jc w:val="center"/>
+            </w:pPr>
+            <w:r/>
+            <w:r>
+              <w:rPr>
+                <w:b/>
+                <w:color w:val="FFFFFF"/>
+                <w:sz w:val="20"/>
+              </w:rPr>
+              <w:t>React Frontend</w:t>
+              <w:br/>
+            </w:r>
+            <w:r>
+              <w:rPr>
+                <w:color w:val="E0E0E0"/>
+                <w:sz w:val="14"/>
+              </w:rPr>
+              <w:t>Session Config  |  Game Monitor  |  Profile Analyzer  |  Replay Viewer</w:t>
+            </w:r>
+          </w:p>
+        </w:tc>
+      </w:tr>
+      <w:tr>
+        <w:tc>
+          <w:tcPr>
+            <w:tcW w:type="dxa" w:w="9405"/>
+            <w:gridSpan w:val="5"/>
+          </w:tcPr>
+          <w:p>
+            <w:pPr>
+              <w:jc w:val="center"/>
+            </w:pPr>
+            <w:r/>
+            <w:r>
+              <w:rPr>
+                <w:color w:val="7F8C8D"/>
+                <w:sz w:val="16"/>
+              </w:rPr>
+              <w:t>↕  HTTP / WebSocket</w:t>
+            </w:r>
+          </w:p>
+        </w:tc>
+      </w:tr>
+      <w:tr>
+        <w:tc>
+          <w:tcPr>
+            <w:tcW w:type="dxa" w:w="9405"/>
+            <w:gridSpan w:val="5"/>
+            <w:shd w:fill="2C3E50" w:val="clear"/>
+          </w:tcPr>
+          <w:p>
+            <w:pPr>
+              <w:jc w:val="center"/>
+            </w:pPr>
+            <w:r/>
+            <w:r>
+              <w:rPr>
+                <w:b/>
+                <w:color w:val="FFFFFF"/>
+                <w:sz w:val="20"/>
+              </w:rPr>
+              <w:t>Python Backend (FastAPI)  —  Play Engine + Session Orchestrator</w:t>
+              <w:br/>
+            </w:r>
+            <w:r>
+              <w:rPr>
+                <w:color w:val="E0E0E0"/>
+                <w:sz w:val="14"/>
+              </w:rPr>
+              <w:t>Playwright Browser Pool  |  Socket.IO Protocol  |  Move Ledger (SQLite)</w:t>
+            </w:r>
+          </w:p>
+        </w:tc>
+      </w:tr>
+      <w:tr>
+        <w:tc>
+          <w:tcPr>
+            <w:tcW w:type="dxa" w:w="9405"/>
+            <w:gridSpan w:val="5"/>
+          </w:tcPr>
+          <w:p>
+            <w:pPr>
+              <w:jc w:val="center"/>
+            </w:pPr>
+            <w:r/>
+            <w:r>
+              <w:rPr>
+                <w:color w:val="7F8C8D"/>
+                <w:sz w:val="16"/>
+              </w:rPr>
+              <w:t>↓  Game State  ↓                        ↑  Actions  ↑</w:t>
+            </w:r>
+          </w:p>
+        </w:tc>
+      </w:tr>
+      <w:tr>
+        <w:tc>
+          <w:tcPr>
+            <w:tcW w:type="dxa" w:w="1881"/>
+            <w:shd w:fill="1A5276" w:val="clear"/>
+          </w:tcPr>
+          <w:p>
+            <w:pPr>
+              <w:jc w:val="center"/>
+            </w:pPr>
+            <w:r/>
+            <w:r>
+              <w:rPr>
+                <w:b/>
+                <w:color w:val="FFFFFF"/>
+                <w:sz w:val="20"/>
+              </w:rPr>
+              <w:t>🛡 VALIDATOR</w:t>
+              <w:br/>
+            </w:r>
+            <w:r>
+              <w:rPr>
+                <w:color w:val="E0E0E0"/>
+                <w:sz w:val="14"/>
+              </w:rPr>
+              <w:t>Rules Engine</w:t>
+              <w:br/>
+              <w:t>47 tests</w:t>
+              <w:br/>
+              <w:t>DONE</w:t>
+            </w:r>
+          </w:p>
+        </w:tc>
+        <w:tc>
+          <w:tcPr>
+            <w:tcW w:type="dxa" w:w="1881"/>
+          </w:tcPr>
+          <w:p>
+            <w:pPr>
+              <w:jc w:val="center"/>
+            </w:pPr>
+            <w:r/>
+            <w:r>
+              <w:rPr>
+                <w:color w:val="7F8C8D"/>
+                <w:sz w:val="16"/>
+              </w:rPr>
+              <w:t>legal</w:t>
+              <w:br/>
+              <w:t>moves</w:t>
+              <w:br/>
+              <w:t>→</w:t>
+            </w:r>
+          </w:p>
+        </w:tc>
+        <w:tc>
+          <w:tcPr>
+            <w:tcW w:type="dxa" w:w="1881"/>
+            <w:shd w:fill="1A6B3C" w:val="clear"/>
+          </w:tcPr>
+          <w:p>
+            <w:pPr>
+              <w:jc w:val="center"/>
+            </w:pPr>
+            <w:r/>
+            <w:r>
+              <w:rPr>
+                <w:b/>
+                <w:color w:val="FFFFFF"/>
+                <w:sz w:val="20"/>
+              </w:rPr>
+              <w:t>⚔ TACTICIAN</w:t>
+              <w:br/>
+            </w:r>
+            <w:r>
+              <w:rPr>
+                <w:color w:val="E0E0E0"/>
+                <w:sz w:val="14"/>
+              </w:rPr>
+              <w:t>GreedyPlayer</w:t>
+              <w:br/>
+              <w:t>MCTS planned</w:t>
+              <w:br/>
+              <w:t>DONE</w:t>
+            </w:r>
+          </w:p>
+        </w:tc>
+        <w:tc>
+          <w:tcPr>
+            <w:tcW w:type="dxa" w:w="1881"/>
+          </w:tcPr>
+          <w:p>
+            <w:pPr>
+              <w:jc w:val="center"/>
+            </w:pPr>
+            <w:r/>
+            <w:r>
+              <w:rPr>
+                <w:color w:val="7F8C8D"/>
+                <w:sz w:val="16"/>
+              </w:rPr>
+              <w:t>game</w:t>
+              <w:br/>
+              <w:t>state</w:t>
+              <w:br/>
+              <w:t>→</w:t>
+            </w:r>
+          </w:p>
+        </w:tc>
+        <w:tc>
+          <w:tcPr>
+            <w:tcW w:type="dxa" w:w="1881"/>
+            <w:shd w:fill="7D3C98" w:val="clear"/>
+          </w:tcPr>
+          <w:p>
+            <w:pPr>
+              <w:jc w:val="center"/>
+            </w:pPr>
+            <w:r/>
+            <w:r>
+              <w:rPr>
+                <w:b/>
+                <w:color w:val="FFFFFF"/>
+                <w:sz w:val="20"/>
+              </w:rPr>
+              <w:t>🔍 PROFILER</w:t>
+              <w:br/>
+            </w:r>
+            <w:r>
+              <w:rPr>
+                <w:color w:val="E0E0E0"/>
+                <w:sz w:val="14"/>
+              </w:rPr>
+              <w:t>Style Analysis</w:t>
+              <w:br/>
+              <w:t>5 traits</w:t>
+              <w:br/>
+              <w:t>DONE</w:t>
+            </w:r>
+          </w:p>
+        </w:tc>
+      </w:tr>
+      <w:tr>
+        <w:tc>
+          <w:tcPr>
+            <w:tcW w:type="dxa" w:w="3762"/>
+            <w:gridSpan w:val="2"/>
+          </w:tcPr>
+          <w:p>
+            <w:pPr>
+              <w:jc w:val="center"/>
+            </w:pPr>
+            <w:r/>
+            <w:r>
+              <w:rPr>
+                <w:i/>
+                <w:color w:val="95A5A6"/>
+                <w:sz w:val="14"/>
+              </w:rPr>
+            </w:r>
+          </w:p>
+        </w:tc>
+        <w:tc>
+          <w:tcPr>
+            <w:tcW w:type="dxa" w:w="1881"/>
+          </w:tcPr>
+          <w:p>
+            <w:pPr>
+              <w:jc w:val="center"/>
+            </w:pPr>
+            <w:r/>
+            <w:r>
+              <w:rPr>
+                <w:color w:val="7F8C8D"/>
+                <w:sz w:val="16"/>
+              </w:rPr>
+              <w:t>↓ artefacts</w:t>
+            </w:r>
+          </w:p>
+        </w:tc>
+        <w:tc>
+          <w:tcPr>
+            <w:tcW w:type="dxa" w:w="3762"/>
+            <w:gridSpan w:val="2"/>
+          </w:tcPr>
+          <w:p>
+            <w:pPr>
+              <w:jc w:val="center"/>
+            </w:pPr>
+            <w:r/>
+            <w:r>
+              <w:rPr>
+                <w:i/>
+                <w:color w:val="95A5A6"/>
+                <w:sz w:val="14"/>
+              </w:rPr>
+            </w:r>
+          </w:p>
+        </w:tc>
+      </w:tr>
+      <w:tr>
+        <w:tc>
+          <w:tcPr>
+            <w:tcW w:type="dxa" w:w="1881"/>
+          </w:tcPr>
+          <w:p>
+            <w:pPr>
+              <w:jc w:val="center"/>
+            </w:pPr>
+            <w:r/>
+            <w:r>
+              <w:rPr>
+                <w:i/>
+                <w:color w:val="95A5A6"/>
+                <w:sz w:val="14"/>
+              </w:rPr>
+            </w:r>
+          </w:p>
+        </w:tc>
+        <w:tc>
+          <w:tcPr>
+            <w:tcW w:type="dxa" w:w="5643"/>
+            <w:gridSpan w:val="3"/>
+            <w:shd w:fill="B7950B" w:val="clear"/>
+          </w:tcPr>
+          <w:p>
+            <w:pPr>
+              <w:jc w:val="center"/>
+            </w:pPr>
+            <w:r/>
+            <w:r>
+              <w:rPr>
+                <w:b/>
+                <w:color w:val="FFFFFF"/>
+                <w:sz w:val="20"/>
+              </w:rPr>
+              <w:t>💬 EXPLAINER</w:t>
+              <w:br/>
+            </w:r>
+            <w:r>
+              <w:rPr>
+                <w:color w:val="E0E0E0"/>
+                <w:sz w:val="14"/>
+              </w:rPr>
+              <w:t>Board Snapshots | Profile Summaries | NL Commentary (planned)</w:t>
+            </w:r>
+          </w:p>
+        </w:tc>
+        <w:tc>
+          <w:tcPr>
+            <w:tcW w:type="dxa" w:w="1881"/>
+          </w:tcPr>
+          <w:p>
+            <w:pPr>
+              <w:jc w:val="center"/>
+            </w:pPr>
+            <w:r/>
+            <w:r>
+              <w:rPr>
+                <w:i/>
+                <w:color w:val="95A5A6"/>
+                <w:sz w:val="14"/>
+              </w:rPr>
+            </w:r>
+          </w:p>
+        </w:tc>
+      </w:tr>
+    </w:tbl>
+    <w:p/>
+    <w:tbl>
+      <w:tblPr>
+        <w:tblW w:type="auto" w:w="0"/>
+        <w:jc w:val="center"/>
+        <w:tblLook w:firstColumn="1" w:firstRow="1" w:lastColumn="0" w:lastRow="0" w:noHBand="0" w:noVBand="1" w:val="04A0"/>
+      </w:tblPr>
+      <w:tblGrid>
+        <w:gridCol w:w="9406"/>
+      </w:tblGrid>
+      <w:tr>
+        <w:tc>
+          <w:tcPr>
+            <w:tcW w:type="dxa" w:w="9406"/>
+            <w:shd w:fill="616A6B" w:val="clear"/>
+          </w:tcPr>
+          <w:p>
+            <w:pPr>
+              <w:jc w:val="center"/>
+            </w:pPr>
+            <w:r/>
+            <w:r>
+              <w:rPr>
+                <w:b/>
+                <w:color w:val="FFFFFF"/>
+                <w:sz w:val="20"/>
+              </w:rPr>
+              <w:t>🌐  buddyboardgames.com/azul</w:t>
+              <w:br/>
+            </w:r>
+            <w:r>
+              <w:rPr>
+                <w:color w:val="E0E0E0"/>
+                <w:sz w:val="14"/>
+              </w:rPr>
+              <w:t>External Game Platform  |  Socket.IO  |  2-4 Player Rooms</w:t>
+            </w:r>
+          </w:p>
+        </w:tc>
+      </w:tr>
+    </w:tbl>
+    <w:p/>
+    <w:p>
+      <w:r>
+        <w:t>The four AI components form the Multi-Agent Decision Stack. Each is implemented as an independent module with a defined Python ABC interface, allowing components to be swapped or upgraded without affecting the rest of the system.</w:t>
       </w:r>
     </w:p>
     <w:p>
+      <w:pPr>
+        <w:pStyle w:val="Heading2"/>
+      </w:pPr>
       <w:r>
-        <w:t>Each component in the stack is implemented as an independent module with a defined interface, allowing components to be swapped or upgraded without affecting the rest of the system.</w:t>
+        <w:rPr>
+          <w:color w:val="1A5276"/>
+        </w:rPr>
+        <w:t>3.2 Component Details</w:t>
       </w:r>
     </w:p>
     <w:tbl>
@@ -478,7 +916,7 @@
         </w:tc>
         <w:tc>
           <w:tcPr>
-            <w:tcW w:type="dxa" w:w="1440"/>
+            <w:tcW w:type="dxa" w:w="1152"/>
           </w:tcPr>
           <w:p>
             <w:pPr>
@@ -504,7 +942,7 @@
               <w:rPr>
                 <w:sz w:val="20"/>
               </w:rPr>
-              <w:t>Validator</w:t>
+              <w:t>🛡 Validator</w:t>
             </w:r>
           </w:p>
         </w:tc>
@@ -517,7 +955,7 @@
               <w:rPr>
                 <w:sz w:val="20"/>
               </w:rPr>
-              <w:t>Deterministic rules engine. Validates legal moves, computes scores, detects game-over conditions. The only component that defines state transitions.</w:t>
+              <w:t>Deterministic rules engine. Validates legal moves, computes scores, detects game-over. The only component that defines state transitions.</w:t>
             </w:r>
           </w:p>
         </w:tc>
@@ -536,7 +974,7 @@
         </w:tc>
         <w:tc>
           <w:tcPr>
-            <w:tcW w:type="dxa" w:w="1440"/>
+            <w:tcW w:type="dxa" w:w="1152"/>
           </w:tcPr>
           <w:p>
             <w:r>
@@ -558,7 +996,7 @@
               <w:rPr>
                 <w:sz w:val="20"/>
               </w:rPr>
-              <w:t>Tactician</w:t>
+              <w:t>⚔ Tactician</w:t>
             </w:r>
           </w:p>
         </w:tc>
@@ -584,22 +1022,22 @@
               <w:rPr>
                 <w:sz w:val="20"/>
               </w:rPr>
-              <w:t>GreedyPlayer — heuristic scoring engine. Evaluates wall placement value, pattern line progress, end-game bonus potential, and overflow penalties. Beats RandomPlayer 43-3.</w:t>
+              <w:t>GreedyPlayer — heuristic scoring engine. Evaluates wall placement, pattern line progress, bonus potential. Beats RandomPlayer 43-3.</w:t>
             </w:r>
           </w:p>
         </w:tc>
         <w:tc>
           <w:tcPr>
-            <w:tcW w:type="dxa" w:w="1440"/>
+            <w:tcW w:type="dxa" w:w="1152"/>
           </w:tcPr>
           <w:p>
             <w:r>
               <w:rPr>
                 <w:sz w:val="20"/>
               </w:rPr>
-              <w:t>DONE (heuristic)</w:t>
+              <w:t>DONE</w:t>
               <w:br/>
-              <w:t>MCTS planned</w:t>
+              <w:t>(MCTS planned)</w:t>
             </w:r>
           </w:p>
         </w:tc>
@@ -614,7 +1052,7 @@
               <w:rPr>
                 <w:sz w:val="20"/>
               </w:rPr>
-              <w:t>Profiler</w:t>
+              <w:t>🔍 Profiler</w:t>
             </w:r>
           </w:p>
         </w:tc>
@@ -640,22 +1078,22 @@
               <w:rPr>
                 <w:sz w:val="20"/>
               </w:rPr>
-              <w:t>BasicProfileAnalyzer — computes color preferences, source/destination splits, timing metrics, and scoring trajectories. Generates natural language summaries.</w:t>
+              <w:t>BasicProfileAnalyzer — color preferences, source/dest splits, timing metrics, scoring trajectories. NL summaries.</w:t>
             </w:r>
           </w:p>
         </w:tc>
         <w:tc>
           <w:tcPr>
-            <w:tcW w:type="dxa" w:w="1440"/>
+            <w:tcW w:type="dxa" w:w="1152"/>
           </w:tcPr>
           <w:p>
             <w:r>
               <w:rPr>
                 <w:sz w:val="20"/>
               </w:rPr>
-              <w:t>DONE (rule-based)</w:t>
+              <w:t>DONE</w:t>
               <w:br/>
-              <w:t>ML-based planned</w:t>
+              <w:t>(ML planned)</w:t>
             </w:r>
           </w:p>
         </w:tc>
@@ -670,7 +1108,7 @@
               <w:rPr>
                 <w:sz w:val="20"/>
               </w:rPr>
-              <w:t>Explainer</w:t>
+              <w:t>💬 Explainer</w:t>
             </w:r>
           </w:p>
         </w:tc>
@@ -683,7 +1121,7 @@
               <w:rPr>
                 <w:sz w:val="20"/>
               </w:rPr>
-              <w:t>Renders human-readable explanations of AI decisions by consuming artefacts from Tactician and Validator.</w:t>
+              <w:t>Renders human-readable explanations by consuming artefacts from Tactician and Validator.</w:t>
             </w:r>
           </w:p>
         </w:tc>
@@ -696,13 +1134,13 @@
               <w:rPr>
                 <w:sz w:val="20"/>
               </w:rPr>
-              <w:t>Profile summaries and move-level board snapshots with highlighted source/destination. GreedyPlayer score breakdown available for future NL generation.</w:t>
+              <w:t>Profile summaries, move-level board snapshots with highlighted source/destination. Score breakdown available for NL generation.</w:t>
             </w:r>
           </w:p>
         </w:tc>
         <w:tc>
           <w:tcPr>
-            <w:tcW w:type="dxa" w:w="1440"/>
+            <w:tcW w:type="dxa" w:w="1152"/>
           </w:tcPr>
           <w:p>
             <w:r>
@@ -724,7 +1162,7 @@
         <w:rPr>
           <w:color w:val="1A5276"/>
         </w:rPr>
-        <w:t>3.2 Platform Integration</w:t>
+        <w:t>3.3 Platform Integration</w:t>
       </w:r>
     </w:p>
     <w:p>
@@ -784,7 +1222,7 @@
         <w:rPr>
           <w:color w:val="1A5276"/>
         </w:rPr>
-        <w:t>3.3 Data Architecture</w:t>
+        <w:t>3.4 Data Architecture</w:t>
       </w:r>
     </w:p>
     <w:p>

</xml_diff>

<commit_message>
Rename OppoProfile to TILES across entire codebase
Replaced all references:
- OppoProfile -> TILES (display name, titles, docs)
- oppo_profile -> tiles (DB names, file paths)
- OPPO_DB_PATH -> TILES_DB_PATH (env var)
- __oppo_socket -> __tiles_socket (JS browser vars)
- oppoprofile_ -> tiles_ (export filenames)

All 63 tests pass, frontend builds clean.

Co-Authored-By: Claude Opus 4.6 (1M context) <noreply@anthropic.com>
</commit_message>
<xml_diff>
--- a/docs/Milestone_1_Report.docx
+++ b/docs/Milestone_1_Report.docx
@@ -152,12 +152,12 @@
     </w:p>
     <w:p>
       <w:r>
-        <w:t>This project investigates how explainable multi-agent systems can be architected for imperfect-profile games — games where opponent intentions and play styles are unknown and must be inferred during gameplay. Using Azul as a case study, we develop both the research framework and a supporting platform, OppoProfile, that enables AI agents to compete on a live game platform, record complete game data, and profile opponent behavior.</w:t>
+        <w:t>This project investigates how explainable multi-agent systems can be architected for imperfect-profile games — games where opponent intentions and play styles are unknown and must be inferred during gameplay. Using Azul as a case study, we develop both the research framework and a supporting platform, TILES, that enables AI agents to compete on a live game platform, record complete game data, and profile opponent behavior.</w:t>
       </w:r>
     </w:p>
     <w:p>
       <w:r>
-        <w:t>In this first milestone, we have delivered OppoProfile as a fully functional MVP that can:</w:t>
+        <w:t>In this first milestone, we have delivered TILES as a fully functional MVP that can:</w:t>
       </w:r>
     </w:p>
     <w:p>
@@ -194,7 +194,7 @@
     </w:p>
     <w:p>
       <w:r>
-        <w:t>OppoProfile is built on a modern, extensible architecture (React + FastAPI + Playwright + SQLite) with 105 automated tests. It serves as the experimental platform for the research components: opponent modeling, adaptive play strategies, and explainable decision-making.</w:t>
+        <w:t>TILES is built on a modern, extensible architecture (React + FastAPI + Playwright + SQLite) with 105 automated tests. It serves as the experimental platform for the research components: opponent modeling, adaptive play strategies, and explainable decision-making.</w:t>
       </w:r>
     </w:p>
     <w:p>
@@ -215,7 +215,7 @@
     </w:p>
     <w:p>
       <w:r>
-        <w:t>However, no existing platform connects a live game environment to a modular ML pipeline where agents can play, observe, and learn. OppoProfile solves this by providing four key capabilities:</w:t>
+        <w:t>However, no existing platform connects a live game environment to a modular ML pipeline where agents can play, observe, and learn. TILES solves this by providing four key capabilities:</w:t>
       </w:r>
     </w:p>
     <w:tbl>
@@ -2319,7 +2319,7 @@
     </w:p>
     <w:p>
       <w:r>
-        <w:t>This is the core vision of OppoProfile — agents that don't just play well, but play differently based on who they're facing. The profiling framework enables a unified player-profiler agent that builds a real-time behavioral model of the opponent during gameplay, predicts which tiles the opponent will pick next, adapts its strategy dynamically (blocking preferred colors, competing for the same factory), and tests hypotheses by making exploratory moves.</w:t>
+        <w:t>This is the core vision of TILES — agents that don't just play well, but play differently based on who they're facing. The profiling framework enables a unified player-profiler agent that builds a real-time behavioral model of the opponent during gameplay, predicts which tiles the opponent will pick next, adapts its strategy dynamically (blocking preferred colors, competing for the same factory), and tests hypotheses by making exploratory moves.</w:t>
       </w:r>
     </w:p>
     <w:p>
@@ -2625,7 +2625,7 @@
     </w:p>
     <w:p>
       <w:r>
-        <w:t>OppoProfile has reached a solid MVP state with a working end-to-end pipeline: AI agents autonomously play Azul on the live platform, every move is recorded with full board state, and player behavior can be analyzed through pluggable profilers. The architecture is deliberately modular — new ML models, new analyzers, and even new games can be added without restructuring the core platform.</w:t>
+        <w:t>TILES has reached a solid MVP state with a working end-to-end pipeline: AI agents autonomously play Azul on the live platform, every move is recorded with full board state, and player behavior can be analyzed through pluggable profilers. The architecture is deliberately modular — new ML models, new analyzers, and even new games can be added without restructuring the core platform.</w:t>
       </w:r>
     </w:p>
     <w:p>

</xml_diff>